<commit_message>
Update sprint 8 report with GitHub Actions evidence
</commit_message>
<xml_diff>
--- a/Entrega_Sprint_8_ISO_Schemathesis_CI.docx
+++ b/Entrega_Sprint_8_ISO_Schemathesis_CI.docx
@@ -3935,7 +3935,7 @@
           <w:i w:val="0"/>
           <w:sz w:val="24"/>
         </w:rPr>
-        <w:t>Pendente de publicacao. O workspace local nao possui remote Git configurado, entao nao inventei URL. Os arquivos .github/workflows/test.yml, requirements.txt, openapi.yaml e scripts/gera_matriz.py ja estao prontos para commit e push.</w:t>
+        <w:t>Repositorio publico: https://github.com/tanasouza/internet_banking_tests. O workflow executado esta disponivel em: https://github.com/tanasouza/internet_banking_tests/actions/runs/28097608283.</w:t>
       </w:r>
     </w:p>
     <w:p>
@@ -3963,7 +3963,46 @@
           <w:i w:val="0"/>
           <w:sz w:val="24"/>
         </w:rPr>
-        <w:t>Pendente ate o primeiro push para o GitHub. Como evidencia local equivalente, executei a suite agregada com a API ativa e o resultado foi 29 passed em 4.05s. O Schemathesis final gerou 370 casos e 370 passaram.</w:t>
+        <w:t>O ultimo run do GitHub Actions foi executado no branch main, por push, com status completed/success. O workflow foi Testes do internet banking e durou 37 segundos, de 2026-06-24T12:12:58Z a 2026-06-24T12:13:35Z.</w:t>
+      </w:r>
+    </w:p>
+    <w:p>
+      <w:pPr>
+        <w:jc w:val="center"/>
+      </w:pPr>
+      <w:r>
+        <w:drawing>
+          <wp:inline xmlns:a="http://schemas.openxmlformats.org/drawingml/2006/main" xmlns:pic="http://schemas.openxmlformats.org/drawingml/2006/picture">
+            <wp:extent cx="5760720" cy="2674620"/>
+            <wp:docPr id="1" name="Picture 1"/>
+            <wp:cNvGraphicFramePr>
+              <a:graphicFrameLocks noChangeAspect="1"/>
+            </wp:cNvGraphicFramePr>
+            <a:graphic>
+              <a:graphicData uri="http://schemas.openxmlformats.org/drawingml/2006/picture">
+                <pic:pic>
+                  <pic:nvPicPr>
+                    <pic:cNvPr id="0" name="actions_sprint8_run.png"/>
+                    <pic:cNvPicPr/>
+                  </pic:nvPicPr>
+                  <pic:blipFill>
+                    <a:blip r:embed="rId9"/>
+                    <a:stretch>
+                      <a:fillRect/>
+                    </a:stretch>
+                  </pic:blipFill>
+                  <pic:spPr>
+                    <a:xfrm>
+                      <a:off x="0" y="0"/>
+                      <a:ext cx="5760720" cy="2674620"/>
+                    </a:xfrm>
+                    <a:prstGeom prst="rect"/>
+                  </pic:spPr>
+                </pic:pic>
+              </a:graphicData>
+            </a:graphic>
+          </wp:inline>
+        </w:drawing>
       </w:r>
     </w:p>
     <w:p>
@@ -4027,7 +4066,7 @@
           <w:rFonts w:ascii="Courier New" w:hAnsi="Courier New"/>
           <w:sz w:val="16"/>
         </w:rPr>
-        <w:t>| TC-S1-001 | REQ-TRF-001 - Transferir valor total disponivel quando ha saldo suficiente | test_transferencia_saldo_igual_valor | test_ia_gerado.py / test_flask_client.py | PASSED em 0.028s |</w:t>
+        <w:t>| TC-S1-001 | REQ-TRF-001 - Transferir valor total disponivel quando ha saldo suficiente | test_transferencia_saldo_igual_valor | test_ia_gerado.py / test_flask_client.py | PASSED em 0.006s |</w:t>
       </w:r>
       <w:r>
         <w:br/>
@@ -4037,7 +4076,7 @@
           <w:rFonts w:ascii="Courier New" w:hAnsi="Courier New"/>
           <w:sz w:val="16"/>
         </w:rPr>
-        <w:t>| TC-S3-001 | REQ-TRF-002 - Recusar valor zero ou negativo | test_transferencia_valor_nao_positivo_retorna_422 | test_hypothesis.py | PASSED em 0.285s |</w:t>
+        <w:t>| TC-S3-001 | REQ-TRF-002 - Recusar valor zero ou negativo | test_transferencia_valor_nao_positivo_retorna_422 | test_hypothesis.py | PASSED em 0.086s |</w:t>
       </w:r>
       <w:r>
         <w:br/>
@@ -4047,7 +4086,7 @@
           <w:rFonts w:ascii="Courier New" w:hAnsi="Courier New"/>
           <w:sz w:val="16"/>
         </w:rPr>
-        <w:t>| TC-S4-001 | REQ-TRF-003 - Recusar conta inexistente | test_transferencia_conta_origem_inexistente | test_flask_client.py | PASSED em 0.013s |</w:t>
+        <w:t>| TC-S4-001 | REQ-TRF-003 - Recusar conta inexistente | test_transferencia_conta_origem_inexistente | test_flask_client.py | PASSED em 0.002s |</w:t>
       </w:r>
       <w:r>
         <w:br/>
@@ -4057,7 +4096,7 @@
           <w:rFonts w:ascii="Courier New" w:hAnsi="Courier New"/>
           <w:sz w:val="16"/>
         </w:rPr>
-        <w:t>| TC-S5-001 | REQ-TRF-004 - Aceitar qualquer valor positivo com saldo suficiente | test_aceitar_transferencia_de_pequeno_valor_positivo | features/transferencia.feature | PASSED em 0.026s |</w:t>
+        <w:t>| TC-S5-001 | REQ-TRF-004 - Aceitar qualquer valor positivo com saldo suficiente | test_aceitar_transferencia_de_pequeno_valor_positivo | features/transferencia.feature | PASSED em 0.007s |</w:t>
       </w:r>
       <w:r>
         <w:br/>
@@ -4067,7 +4106,7 @@
           <w:rFonts w:ascii="Courier New" w:hAnsi="Courier New"/>
           <w:sz w:val="16"/>
         </w:rPr>
-        <w:t>| TC-S5-002 | REQ-TRF-005 - Recusar transferencia com campo obrigatorio ausente | test_recusar_transferencia_sem_conta_de_destino | features/transferencia.feature | PASSED em 0.018s |</w:t>
+        <w:t>| TC-S5-002 | REQ-TRF-005 - Recusar transferencia com campo obrigatorio ausente | test_recusar_transferencia_sem_conta_de_destino | features/transferencia.feature | PASSED em 0.004s |</w:t>
       </w:r>
     </w:p>
     <w:p>

</xml_diff>

<commit_message>
Refresh sprint 8 report with final Actions run
</commit_message>
<xml_diff>
--- a/Entrega_Sprint_8_ISO_Schemathesis_CI.docx
+++ b/Entrega_Sprint_8_ISO_Schemathesis_CI.docx
@@ -3935,7 +3935,7 @@
           <w:i w:val="0"/>
           <w:sz w:val="24"/>
         </w:rPr>
-        <w:t>Repositorio publico: https://github.com/tanasouza/internet_banking_tests. O workflow executado esta disponivel em: https://github.com/tanasouza/internet_banking_tests/actions/runs/28097608283.</w:t>
+        <w:t>Repositorio publico: https://github.com/tanasouza/internet_banking_tests. O workflow executado esta disponivel em: https://github.com/tanasouza/internet_banking_tests/actions/runs/28097911010.</w:t>
       </w:r>
     </w:p>
     <w:p>
@@ -3963,7 +3963,7 @@
           <w:i w:val="0"/>
           <w:sz w:val="24"/>
         </w:rPr>
-        <w:t>O ultimo run do GitHub Actions foi executado no branch main, por push, com status completed/success. O workflow foi Testes do internet banking e durou 37 segundos, de 2026-06-24T12:12:58Z a 2026-06-24T12:13:35Z.</w:t>
+        <w:t>O ultimo run do GitHub Actions foi executado no branch main, por push, com status completed/success. O workflow foi Testes do internet banking e durou 32 segundos, de 2026-06-24T12:18:30Z a 2026-06-24T12:19:02Z.</w:t>
       </w:r>
     </w:p>
     <w:p>
@@ -4076,7 +4076,7 @@
           <w:rFonts w:ascii="Courier New" w:hAnsi="Courier New"/>
           <w:sz w:val="16"/>
         </w:rPr>
-        <w:t>| TC-S3-001 | REQ-TRF-002 - Recusar valor zero ou negativo | test_transferencia_valor_nao_positivo_retorna_422 | test_hypothesis.py | PASSED em 0.086s |</w:t>
+        <w:t>| TC-S3-001 | REQ-TRF-002 - Recusar valor zero ou negativo | test_transferencia_valor_nao_positivo_retorna_422 | test_hypothesis.py | PASSED em 0.088s |</w:t>
       </w:r>
       <w:r>
         <w:br/>
@@ -4096,7 +4096,7 @@
           <w:rFonts w:ascii="Courier New" w:hAnsi="Courier New"/>
           <w:sz w:val="16"/>
         </w:rPr>
-        <w:t>| TC-S5-001 | REQ-TRF-004 - Aceitar qualquer valor positivo com saldo suficiente | test_aceitar_transferencia_de_pequeno_valor_positivo | features/transferencia.feature | PASSED em 0.007s |</w:t>
+        <w:t>| TC-S5-001 | REQ-TRF-004 - Aceitar qualquer valor positivo com saldo suficiente | test_aceitar_transferencia_de_pequeno_valor_positivo | features/transferencia.feature | PASSED em 0.008s |</w:t>
       </w:r>
       <w:r>
         <w:br/>

</xml_diff>

<commit_message>
Use real Actions screenshot in sprint 8 report
</commit_message>
<xml_diff>
--- a/Entrega_Sprint_8_ISO_Schemathesis_CI.docx
+++ b/Entrega_Sprint_8_ISO_Schemathesis_CI.docx
@@ -3973,7 +3973,7 @@
       <w:r>
         <w:drawing>
           <wp:inline xmlns:a="http://schemas.openxmlformats.org/drawingml/2006/main" xmlns:pic="http://schemas.openxmlformats.org/drawingml/2006/picture">
-            <wp:extent cx="5760720" cy="2674620"/>
+            <wp:extent cx="5760720" cy="4800600"/>
             <wp:docPr id="1" name="Picture 1"/>
             <wp:cNvGraphicFramePr>
               <a:graphicFrameLocks noChangeAspect="1"/>
@@ -3982,7 +3982,7 @@
               <a:graphicData uri="http://schemas.openxmlformats.org/drawingml/2006/picture">
                 <pic:pic>
                   <pic:nvPicPr>
-                    <pic:cNvPr id="0" name="actions_sprint8_run.png"/>
+                    <pic:cNvPr id="0" name="actions_sprint8_run_real.png"/>
                     <pic:cNvPicPr/>
                   </pic:nvPicPr>
                   <pic:blipFill>
@@ -3994,7 +3994,7 @@
                   <pic:spPr>
                     <a:xfrm>
                       <a:off x="0" y="0"/>
-                      <a:ext cx="5760720" cy="2674620"/>
+                      <a:ext cx="5760720" cy="4800600"/>
                     </a:xfrm>
                     <a:prstGeom prst="rect"/>
                   </pic:spPr>

</xml_diff>